<commit_message>
docs(pruebas): alinear los casos de prueba con el sistema construido
Corrige la entrada y el resultado esperado de CP-02 a CP-22: el bloqueo
cambia el estado de la cotización (no del salón), la garantía se
registra con tipo y monto (sin comprobante) y confirma el evento, la
cancelación calcula el monto retenido, el proveedor registra stock (no
montajes) y recuperar contraseña usa un enlace de un solo uso y no
revela si el correo existe. Quita "duración", "horario" y "finalizado",
que no existen en la beta.

Refs: SGDE-57
</commit_message>
<xml_diff>
--- a/docs/Casos de Prueba - Sistema de Gestión de Eventos.docx
+++ b/docs/Casos de Prueba - Sistema de Gestión de Eventos.docx
@@ -537,7 +537,7 @@
               <w:jc w:val="center"/>
             </w:pPr>
             <w:r>
-              <w:t>Al momento de registrar un cliente, se dejan campos obligatorios vacíos</w:t>
+              <w:t xml:space="preserve">Al registrar un cliente se dejan campos obligatorios vacíos (por ejemplo, el nombre, o la empresa de un cliente jurídico)</w:t>
             </w:r>
           </w:p>
         </w:tc>
@@ -571,7 +571,7 @@
               <w:jc w:val="center"/>
             </w:pPr>
             <w:r>
-              <w:t>El sistema manda una alerta donde notifica que todos los campos son obligatorios.</w:t>
+              <w:t xml:space="preserve">El sistema rechaza el registro y marca el error bajo cada campo obligatorio vacío.</w:t>
             </w:r>
           </w:p>
         </w:tc>
@@ -706,7 +706,7 @@
               <w:jc w:val="center"/>
             </w:pPr>
             <w:r>
-              <w:t>Al momento de registrar una cuenta ingresa un correo o documento que ya se encuentra en la base de datos</w:t>
+              <w:t xml:space="preserve">Se registra un cliente con una identificación que ya existe, o una cuenta pública con un correo que ya está registrado</w:t>
             </w:r>
           </w:p>
         </w:tc>
@@ -740,7 +740,7 @@
               <w:jc w:val="center"/>
             </w:pPr>
             <w:r>
-              <w:t>El sistema manda una alerta diciendo que ya existe una cuenta con ese correo o documento.</w:t>
+              <w:t xml:space="preserve">El sistema rechaza el registro e indica, en el campo correspondiente, que ese dato ya está registrado.</w:t>
             </w:r>
           </w:p>
         </w:tc>
@@ -875,11 +875,11 @@
               <w:jc w:val="center"/>
             </w:pPr>
             <w:r>
-              <w:t xml:space="preserve">Los datos del salón (nombre, dimensiones, capacidad, características y fotos) fueron validados </w:t>
+              <w:t xml:space="preserve">Se registran los datos válidos de un salón: sitio, nombre, alto, ancho y foto (URL)</w:t>
             </w:r>
             <w:r>
               <w:lastRenderedPageBreak/>
-              <w:t>exitosamente</w:t>
+              <w:t xml:space="preserve"/>
             </w:r>
           </w:p>
         </w:tc>
@@ -914,7 +914,7 @@
             </w:pPr>
             <w:r>
               <w:lastRenderedPageBreak/>
-              <w:t>El sistema registra el salón correctamente con todos sus datos y lo deja disponible.</w:t>
+              <w:t xml:space="preserve">El sistema registra el salón activo en ese sitio; su aforo se define por montaje (CP-06).</w:t>
             </w:r>
           </w:p>
         </w:tc>
@@ -1049,7 +1049,7 @@
               <w:jc w:val="center"/>
             </w:pPr>
             <w:r>
-              <w:t>Se intenta registrar un salón ingresando capacidad negativa o valores no numéricos en las dimensiones</w:t>
+              <w:t xml:space="preserve">Se intenta registrar un salón con alto o ancho negativos o no numéricos</w:t>
             </w:r>
           </w:p>
         </w:tc>
@@ -1083,7 +1083,7 @@
               <w:jc w:val="center"/>
             </w:pPr>
             <w:r>
-              <w:t>El sistema rechaza la solicitud de registro y despliega un mensaje de error de formato.</w:t>
+              <w:t xml:space="preserve">El sistema rechaza el registro y marca el error de formato en el campo.</w:t>
             </w:r>
           </w:p>
         </w:tc>
@@ -1218,7 +1218,7 @@
               <w:jc w:val="center"/>
             </w:pPr>
             <w:r>
-              <w:t>Se configuran los tipos de montaje disponibles (ej. Auditorio, Banquete) y sus respectivas capacidades asociadas</w:t>
+              <w:t xml:space="preserve">Se habilitan en un salón los tipos de montaje disponibles (ej. Auditorio, Escuela) con su aforo</w:t>
             </w:r>
           </w:p>
         </w:tc>
@@ -1252,7 +1252,7 @@
               <w:jc w:val="center"/>
             </w:pPr>
             <w:r>
-              <w:t>El sistema guarda la configuración de los tipos de montaje y actualiza sus límites de capacidad.</w:t>
+              <w:t xml:space="preserve">El sistema guarda cada combinación salón–montaje con su aforo y no permite repetir un montaje en el mismo salón.</w:t>
             </w:r>
           </w:p>
         </w:tc>
@@ -1387,7 +1387,7 @@
               <w:jc w:val="center"/>
             </w:pPr>
             <w:r>
-              <w:t>Se consulta la disponibilidad a través del calendario para una fecha y horario sin reservas agendadas</w:t>
+              <w:t xml:space="preserve">Se consulta en el calendario o en el rack un día en que el salón no tiene cotizaciones</w:t>
             </w:r>
           </w:p>
         </w:tc>
@@ -1421,7 +1421,7 @@
               <w:jc w:val="center"/>
             </w:pPr>
             <w:r>
-              <w:t>El sistema despliega el salón con estado "Disponible" para el rango de tiempo seleccionado.</w:t>
+              <w:t xml:space="preserve">El sistema muestra ese día libre para el salón.</w:t>
             </w:r>
           </w:p>
         </w:tc>
@@ -1556,11 +1556,11 @@
               <w:jc w:val="center"/>
             </w:pPr>
             <w:r>
-              <w:t xml:space="preserve">Se consulta el calendario para una fecha y horario en los que el salón ya posee una </w:t>
+              <w:t xml:space="preserve">Se consulta en el calendario o en el rack un día en que el salón tiene una cotización cotizada, bloqueada o confirmada</w:t>
             </w:r>
             <w:r>
               <w:lastRenderedPageBreak/>
-              <w:t>reserva o bloqueo</w:t>
+              <w:t xml:space="preserve"/>
             </w:r>
           </w:p>
         </w:tc>
@@ -1595,7 +1595,7 @@
             </w:pPr>
             <w:r>
               <w:lastRenderedPageBreak/>
-              <w:t>El sistema notifica que el espacio no se encuentra disponible y muestra su estado ocupado/bloqueado.</w:t>
+              <w:t xml:space="preserve">El sistema muestra el día con el color de su estado y, al abrirlo, las cotizaciones de ese día.</w:t>
             </w:r>
           </w:p>
         </w:tc>
@@ -1730,7 +1730,7 @@
               <w:jc w:val="center"/>
             </w:pPr>
             <w:r>
-              <w:t>Se ingresa un nuevo producto o servicio para cotización asignando su precio base e impuestos aplicables</w:t>
+              <w:t xml:space="preserve">Se ingresa un nuevo concepto (producto o servicio) del sitio con su precio e impuesto (%)</w:t>
             </w:r>
           </w:p>
         </w:tc>
@@ -1764,7 +1764,7 @@
               <w:jc w:val="center"/>
             </w:pPr>
             <w:r>
-              <w:t>El sistema registra y habilita el concepto dentro del catálogo administrable para cotizaciones.</w:t>
+              <w:t xml:space="preserve">El sistema registra el concepto activo en el catálogo de ese sitio y lo habilita para cotizaciones.</w:t>
             </w:r>
           </w:p>
         </w:tc>
@@ -1899,7 +1899,7 @@
               <w:jc w:val="center"/>
             </w:pPr>
             <w:r>
-              <w:t>Se selecciona salón, montaje, cantidad de personas, duración, productos, servicios e impuestos válidos</w:t>
+              <w:t xml:space="preserve">Se eligen cliente, salón, montaje, fecha del evento, cantidad de personas y conceptos del catálogo con su cantidad</w:t>
             </w:r>
           </w:p>
         </w:tc>
@@ -1933,7 +1933,7 @@
               <w:jc w:val="center"/>
             </w:pPr>
             <w:r>
-              <w:t>El sistema genera la cotización detallada calculando de forma precisa los costos totales.</w:t>
+              <w:t xml:space="preserve">El sistema genera la cotización en estado cotizado con los precios del catálogo y calcula subtotal, impuestos por tasa y total.</w:t>
             </w:r>
           </w:p>
         </w:tc>
@@ -2068,7 +2068,7 @@
               <w:jc w:val="center"/>
             </w:pPr>
             <w:r>
-              <w:t>Se intenta generar una cotización para un número de asistentes que excede la capacidad máxima del salón/montaje</w:t>
+              <w:t xml:space="preserve">Se intenta generar una cotización con más personas que el aforo del montaje en ese salón</w:t>
             </w:r>
           </w:p>
         </w:tc>
@@ -2102,7 +2102,7 @@
               <w:jc w:val="center"/>
             </w:pPr>
             <w:r>
-              <w:t>El sistema muestra una alerta indicando que la cantidad de personas supera el límite permitido.</w:t>
+              <w:t xml:space="preserve">El sistema rechaza la cotización indicando que la cantidad de personas supera el aforo del montaje.</w:t>
             </w:r>
           </w:p>
         </w:tc>
@@ -2237,11 +2237,11 @@
               <w:jc w:val="center"/>
             </w:pPr>
             <w:r>
-              <w:t xml:space="preserve">Se solicita el bloqueo temporal de un salón para una cotización </w:t>
+              <w:t xml:space="preserve">Se bloquea el salón para una cotización vigente, indicando la fecha y hora límite del bloqueo</w:t>
             </w:r>
             <w:r>
               <w:lastRenderedPageBreak/>
-              <w:t>definiendo la fecha límite de vigencia</w:t>
+              <w:t xml:space="preserve"/>
             </w:r>
           </w:p>
         </w:tc>
@@ -2276,11 +2276,11 @@
             </w:pPr>
             <w:r>
               <w:lastRenderedPageBreak/>
-              <w:t xml:space="preserve">El sistema actualiza el estado del salón a "Bloqueado Temporalmente" durante el período </w:t>
+              <w:t xml:space="preserve">La cotización pasa a estado "bloqueado" hasta esa hora y el salón queda apartado ese día; al vencer, vuelve a "cotizado".</w:t>
             </w:r>
             <w:r>
               <w:lastRenderedPageBreak/>
-              <w:t>indicado.</w:t>
+              <w:t xml:space="preserve"/>
             </w:r>
           </w:p>
         </w:tc>
@@ -2415,7 +2415,7 @@
               <w:jc w:val="center"/>
             </w:pPr>
             <w:r>
-              <w:t>Se intenta realizar una nueva cotización sobre un salón que cuenta con un bloqueo temporal vigente</w:t>
+              <w:t xml:space="preserve">Se intenta bloquear o confirmar otra cotización del mismo salón y día mientras hay un bloqueo vigente</w:t>
             </w:r>
           </w:p>
         </w:tc>
@@ -2449,7 +2449,7 @@
               <w:jc w:val="center"/>
             </w:pPr>
             <w:r>
-              <w:t>El sistema impide el agendamiento y muestra la restricción por bloqueo activo.</w:t>
+              <w:t xml:space="preserve">El sistema lo impide y muestra el aviso de que la fecha está ocupada.</w:t>
             </w:r>
           </w:p>
         </w:tc>
@@ -2584,7 +2584,7 @@
               <w:jc w:val="center"/>
             </w:pPr>
             <w:r>
-              <w:t>El cliente confirma la aceptación de la cotización y se adjunta el comprobante de garantía/pago</w:t>
+              <w:t xml:space="preserve">El cliente acepta la cotización y se registra el tipo de garantía (transferencia, tarjeta, consignación o efectivo) y su monto</w:t>
             </w:r>
           </w:p>
         </w:tc>
@@ -2618,7 +2618,7 @@
               <w:jc w:val="center"/>
             </w:pPr>
             <w:r>
-              <w:t>El sistema guarda la aceptación y valida el registro de la garantía correspondiente.</w:t>
+              <w:t xml:space="preserve">El sistema guarda la garantía con quién y cuándo la registró, y confirma el evento.</w:t>
             </w:r>
           </w:p>
         </w:tc>
@@ -2753,7 +2753,7 @@
               <w:jc w:val="center"/>
             </w:pPr>
             <w:r>
-              <w:t>Se intenta procesar la aceptación de la cotización sin adjuntar el soporte de garantía o pago mínimo</w:t>
+              <w:t xml:space="preserve">Se intenta registrar la aceptación sin el tipo o sin el monto de la garantía</w:t>
             </w:r>
           </w:p>
         </w:tc>
@@ -2787,7 +2787,7 @@
               <w:jc w:val="center"/>
             </w:pPr>
             <w:r>
-              <w:t>El sistema deniega el avance del proceso indicando que la garantía es obligatoria.</w:t>
+              <w:t xml:space="preserve">El sistema no avanza y marca como obligatorio el campo que falta.</w:t>
             </w:r>
           </w:p>
         </w:tc>
@@ -2922,11 +2922,11 @@
               <w:jc w:val="center"/>
             </w:pPr>
             <w:r>
-              <w:t xml:space="preserve">Se procede a confirmar el evento una vez verificadas y aprobadas las condiciones de </w:t>
+              <w:t xml:space="preserve">Se registra la garantía de una cotización cuyo salón está libre ese día</w:t>
             </w:r>
             <w:r>
               <w:lastRenderedPageBreak/>
-              <w:t>garantía</w:t>
+              <w:t xml:space="preserve"/>
             </w:r>
           </w:p>
         </w:tc>
@@ -2961,7 +2961,7 @@
             </w:pPr>
             <w:r>
               <w:lastRenderedPageBreak/>
-              <w:t>El sistema cambia el estado del evento a "Confirmado" y bloquea de manera definitiva el horario en agenda.</w:t>
+              <w:t xml:space="preserve">El estado pasa a "Confirmado" y ninguna otra cotización puede confirmarse en ese salón y día.</w:t>
             </w:r>
           </w:p>
         </w:tc>
@@ -3096,7 +3096,7 @@
               <w:jc w:val="center"/>
             </w:pPr>
             <w:r>
-              <w:t>Se registra la cancelación de un evento indicando la causa y aplicando las políticas del servicio</w:t>
+              <w:t xml:space="preserve">Se cancela un evento confirmado indicando el motivo y la penalización (%)</w:t>
             </w:r>
           </w:p>
         </w:tc>
@@ -3130,7 +3130,7 @@
               <w:jc w:val="center"/>
             </w:pPr>
             <w:r>
-              <w:t>El sistema modifica el estado a "Cancelado", libera la agenda del salón y aplica las retenciones o devoluciones.</w:t>
+              <w:t xml:space="preserve">El sistema cambia el estado a "Cancelado", calcula el monto retenido (total × penalización) y libera la fecha del salón.</w:t>
             </w:r>
           </w:p>
         </w:tc>
@@ -3265,7 +3265,7 @@
               <w:jc w:val="center"/>
             </w:pPr>
             <w:r>
-              <w:t>Se ejecuta una búsqueda en el historial filtrando por eventos confirmados, cancelados o finalizados</w:t>
+              <w:t xml:space="preserve">Se busca en el histórico filtrando por estado (cotizado, bloqueado, confirmado o cancelado), cliente o rango de fechas</w:t>
             </w:r>
           </w:p>
         </w:tc>
@@ -3299,7 +3299,7 @@
               <w:jc w:val="center"/>
             </w:pPr>
             <w:r>
-              <w:t>El sistema recupera y muestra el listado detallado de la información histórica de los eventos.</w:t>
+              <w:t xml:space="preserve">El sistema muestra el listado de cotizaciones que cumplen el filtro y, en cada una, quién hizo cada cambio y cuándo.</w:t>
             </w:r>
           </w:p>
         </w:tc>
@@ -3434,7 +3434,7 @@
               <w:jc w:val="center"/>
             </w:pPr>
             <w:r>
-              <w:t>Se ingresan los datos de un nuevo proveedor junto con los tipos de montaje que ofrece</w:t>
+              <w:t xml:space="preserve">Se registran los datos de un nuevo proveedor (nombre, identificación y contacto) y su stock de elementos con cantidad y valor</w:t>
             </w:r>
           </w:p>
         </w:tc>
@@ -3468,7 +3468,7 @@
               <w:jc w:val="center"/>
             </w:pPr>
             <w:r>
-              <w:t>El sistema almacena exitosamente al proveedor y lo vincula con la lista de montajes disponibles.</w:t>
+              <w:t xml:space="preserve">El sistema guarda el proveedor con su stock y permite comparar el precio de un elemento entre proveedores.</w:t>
             </w:r>
           </w:p>
         </w:tc>
@@ -3603,7 +3603,7 @@
               <w:jc w:val="center"/>
             </w:pPr>
             <w:r>
-              <w:t>El usuario solicita el restablecimiento de clave e ingresa el correo electrónico registrado en su cuenta</w:t>
+              <w:t xml:space="preserve">El usuario solicita restablecer su contraseña e ingresa el correo registrado en su cuenta</w:t>
             </w:r>
           </w:p>
         </w:tc>
@@ -3637,7 +3637,7 @@
               <w:jc w:val="center"/>
             </w:pPr>
             <w:r>
-              <w:t>El sistema genera y envía un código de verificación al correo del usuario.</w:t>
+              <w:t xml:space="preserve">El sistema envía al correo un enlace de un solo uso para crear una contraseña nueva (vence en 60 minutos).</w:t>
             </w:r>
           </w:p>
         </w:tc>
@@ -3773,7 +3773,7 @@
               <w:jc w:val="center"/>
             </w:pPr>
             <w:r>
-              <w:t>El usuario intenta solicitar restablecimiento de contraseña ingresando un correo que no está registrado</w:t>
+              <w:t xml:space="preserve">El usuario solicita restablecer la contraseña con un correo que no está registrado</w:t>
             </w:r>
           </w:p>
         </w:tc>
@@ -3807,7 +3807,7 @@
               <w:jc w:val="center"/>
             </w:pPr>
             <w:r>
-              <w:t>El sistema arroja un mensaje de alerta indicando que el correo especificado no existe en la base de datos.</w:t>
+              <w:t xml:space="preserve">El sistema muestra el mismo mensaje que con un correo registrado y no envía nada, para no revelar qué correos existen.</w:t>
             </w:r>
           </w:p>
         </w:tc>
@@ -3942,7 +3942,7 @@
               <w:jc w:val="center"/>
             </w:pPr>
             <w:r>
-              <w:t>El usuario ingresa el código enviado al correo de forma correcta y define una nueva contraseña válida</w:t>
+              <w:t xml:space="preserve">El usuario abre el enlace recibido y define una contraseña nueva válida</w:t>
             </w:r>
           </w:p>
         </w:tc>
@@ -3976,7 +3976,7 @@
               <w:jc w:val="center"/>
             </w:pPr>
             <w:r>
-              <w:t>El sistema actualiza la contraseña exitosamente y habilita el inicio de sesión con las nuevas credenciales.</w:t>
+              <w:t xml:space="preserve">El sistema actualiza la contraseña, cierra las sesiones abiertas y habilita el inicio de sesión con la nueva.</w:t>
             </w:r>
           </w:p>
         </w:tc>

</xml_diff>